<commit_message>
solving problems with the activity 10
</commit_message>
<xml_diff>
--- a/VelázquezVázquezD09Act10/VelázquezVázquezD09Act10.docx
+++ b/VelázquezVázquezD09Act10/VelázquezVázquezD09Act10.docx
@@ -495,7 +495,7 @@
           <w:sz w:val="24"/>
           <w:szCs w:val="24"/>
         </w:rPr>
-        <w:t xml:space="preserve">Conclusiones	5</w:t>
+        <w:t xml:space="preserve">Conclusiones	6</w:t>
       </w:r>
     </w:p>
     <w:p>
@@ -511,7 +511,7 @@
           <w:sz w:val="24"/>
           <w:szCs w:val="24"/>
         </w:rPr>
-        <w:t xml:space="preserve">Bibliografía	5</w:t>
+        <w:t xml:space="preserve">Bibliografía	6</w:t>
       </w:r>
     </w:p>
     <w:p>
@@ -584,7 +584,7 @@
           <w:sz w:val="24"/>
           <w:szCs w:val="24"/>
         </w:rPr>
-        <w:t xml:space="preserve">Ilustración 3. Tabla de procesos (BCP) desplegada con la tecla B	5</w:t>
+        <w:t xml:space="preserve">Ilustración 3. Tabla de procesos (BCP) desplegada con la tecla B	6</w:t>
       </w:r>
     </w:p>
     <w:p>
@@ -600,7 +600,7 @@
           <w:sz w:val="24"/>
           <w:szCs w:val="24"/>
         </w:rPr>
-        <w:t xml:space="preserve">Ilustración 4. Tabla final de procesos al terminar la simulación	5</w:t>
+        <w:t xml:space="preserve">Ilustración 4. Tabla final de procesos al terminar la simulación	6</w:t>
       </w:r>
     </w:p>
     <w:p>
@@ -1320,23 +1320,6 @@
     </w:p>
     <w:p>
       <w:pPr>
-        <w:pStyle w:val="Heading1"/>
-        <w:pageBreakBefore/>
-        <w:spacing w:after="120" w:before="0"/>
-      </w:pPr>
-      <w:r>
-        <w:rPr>
-          <w:rFonts w:ascii="Times New Roman" w:cs="Times New Roman" w:eastAsia="Times New Roman" w:hAnsi="Times New Roman"/>
-          <w:b/>
-          <w:bCs/>
-          <w:sz w:val="24"/>
-          <w:szCs w:val="24"/>
-        </w:rPr>
-        <w:t xml:space="preserve">Capturas de Pantalla</w:t>
-      </w:r>
-    </w:p>
-    <w:p>
-      <w:pPr>
         <w:spacing w:after="110" w:line="320"/>
         <w:ind w:firstLine="720"/>
         <w:jc w:val="both"/>
@@ -1347,40 +1330,84 @@
           <w:sz w:val="24"/>
           <w:szCs w:val="24"/>
         </w:rPr>
-        <w:t xml:space="preserve">Las siguientes ilustraciones corresponden a la ejecución del programa con el algoritmo Round-Robin y las teclas E, W, P, C, N y B.</w:t>
-      </w:r>
-    </w:p>
-    <w:p>
-      <w:pPr>
-        <w:pBdr>
-          <w:top w:val="single" w:color="808080" w:sz="6" w:space="8"/>
-          <w:left w:val="single" w:color="808080" w:sz="6" w:space="8"/>
-          <w:bottom w:val="single" w:color="808080" w:sz="6" w:space="8"/>
-          <w:right w:val="single" w:color="808080" w:sz="6" w:space="8"/>
-        </w:pBdr>
-        <w:shd w:fill="F2F2F2" w:val="clear"/>
-        <w:spacing w:after="80" w:before="120" w:line="240"/>
+        <w:t xml:space="preserve">Al ejecutar el programa para tomar las capturas se detectó un último detalle: al abrir la tabla de procesos con la tecla "B", la tabla interna del diálogo recibía el foco del teclado y la búsqueda por teclado de Qt se quedaba con la letra "C", por lo que la ventana no se cerraba con esa tecla. Se corrigió quitándole el foco a la tabla con setFocusPolicy(Qt.NoFocus), de modo que la tecla llega al diálogo y la simulación continúa exactamente donde se quedó.</w:t>
+      </w:r>
+    </w:p>
+    <w:p>
+      <w:pPr>
+        <w:pStyle w:val="Heading1"/>
+        <w:spacing w:after="120" w:before="240"/>
+      </w:pPr>
+      <w:r>
+        <w:rPr>
+          <w:rFonts w:ascii="Times New Roman" w:cs="Times New Roman" w:eastAsia="Times New Roman" w:hAnsi="Times New Roman"/>
+          <w:b/>
+          <w:bCs/>
+          <w:sz w:val="24"/>
+          <w:szCs w:val="24"/>
+        </w:rPr>
+        <w:t xml:space="preserve">Capturas de Pantalla</w:t>
+      </w:r>
+    </w:p>
+    <w:p>
+      <w:pPr>
+        <w:spacing w:after="110" w:line="320"/>
+        <w:ind w:firstLine="720"/>
+        <w:jc w:val="both"/>
+      </w:pPr>
+      <w:r>
+        <w:rPr>
+          <w:rFonts w:ascii="Times New Roman" w:cs="Times New Roman" w:eastAsia="Times New Roman" w:hAnsi="Times New Roman"/>
+          <w:sz w:val="24"/>
+          <w:szCs w:val="24"/>
+        </w:rPr>
+        <w:t xml:space="preserve">Las siguientes ilustraciones corresponden a una ejecución del programa con 8 procesos iniciales y un Quantum de 3. Durante la simulación se usaron las teclas E (dos interrupciones de entrada/salida), W (el proceso 3 terminó por error), N (se generó el proceso 9), P y C para pausar y continuar, y B para consultar la tabla de procesos.</w:t>
+      </w:r>
+    </w:p>
+    <w:p>
+      <w:pPr>
+        <w:spacing w:after="60" w:before="120"/>
         <w:jc w:val="center"/>
       </w:pPr>
       <w:r>
-        <w:rPr>
-          <w:rFonts w:ascii="Times New Roman" w:cs="Times New Roman" w:eastAsia="Times New Roman" w:hAnsi="Times New Roman"/>
-          <w:sz w:val="24"/>
-          <w:szCs w:val="24"/>
-        </w:rPr>
-        <w:t xml:space="preserve">
-</w:t>
-      </w:r>
-      <w:r>
-        <w:rPr>
-          <w:rFonts w:ascii="Times New Roman" w:cs="Times New Roman" w:eastAsia="Times New Roman" w:hAnsi="Times New Roman"/>
-          <w:i/>
-          <w:iCs/>
-          <w:color w:val="595959"/>
-          <w:sz w:val="22"/>
-          <w:szCs w:val="22"/>
-        </w:rPr>
-        <w:t xml:space="preserve">[Insertar aquí la captura de los cuadros de diálogo: Número de procesos y Valor del Quantum]</w:t>
+        <w:drawing>
+          <wp:inline distT="0" distB="0" distL="0" distR="0">
+            <wp:extent cx="4572000" cy="1428750"/>
+            <wp:effectExtent t="0" r="0" b="0" l="0"/>
+            <wp:docPr id="1" name="dialogos.png" descr="dialogos.png" title="dialogos.png"/>
+            <wp:cNvGraphicFramePr>
+              <a:graphicFrameLocks xmlns:a="http://schemas.openxmlformats.org/drawingml/2006/main" noChangeAspect="1"/>
+            </wp:cNvGraphicFramePr>
+            <a:graphic xmlns:a="http://schemas.openxmlformats.org/drawingml/2006/main">
+              <a:graphicData uri="http://schemas.openxmlformats.org/drawingml/2006/picture">
+                <pic:pic xmlns:pic="http://schemas.openxmlformats.org/drawingml/2006/picture">
+                  <pic:nvPicPr>
+                    <pic:cNvPr id="0" name="" descr=""/>
+                    <pic:cNvPicPr>
+                      <a:picLocks noChangeAspect="1" noChangeArrowheads="1"/>
+                    </pic:cNvPicPr>
+                  </pic:nvPicPr>
+                  <pic:blipFill>
+                    <a:blip r:embed="rId9" cstate="none"/>
+                    <a:srcRect/>
+                    <a:stretch>
+                      <a:fillRect/>
+                    </a:stretch>
+                  </pic:blipFill>
+                  <pic:spPr bwMode="auto">
+                    <a:xfrm>
+                      <a:off x="0" y="0"/>
+                      <a:ext cx="4572000" cy="1428750"/>
+                    </a:xfrm>
+                    <a:prstGeom prst="rect">
+                      <a:avLst/>
+                    </a:prstGeom>
+                  </pic:spPr>
+                </pic:pic>
+              </a:graphicData>
+            </a:graphic>
+          </wp:inline>
+        </w:drawing>
       </w:r>
     </w:p>
     <w:p>
@@ -1401,35 +1428,48 @@
     </w:p>
     <w:p>
       <w:pPr>
-        <w:pBdr>
-          <w:top w:val="single" w:color="808080" w:sz="6" w:space="8"/>
-          <w:left w:val="single" w:color="808080" w:sz="6" w:space="8"/>
-          <w:bottom w:val="single" w:color="808080" w:sz="6" w:space="8"/>
-          <w:right w:val="single" w:color="808080" w:sz="6" w:space="8"/>
-        </w:pBdr>
-        <w:shd w:fill="F2F2F2" w:val="clear"/>
-        <w:spacing w:after="80" w:before="120" w:line="240"/>
+        <w:spacing w:after="60" w:before="120"/>
         <w:jc w:val="center"/>
       </w:pPr>
       <w:r>
-        <w:rPr>
-          <w:rFonts w:ascii="Times New Roman" w:cs="Times New Roman" w:eastAsia="Times New Roman" w:hAnsi="Times New Roman"/>
-          <w:sz w:val="24"/>
-          <w:szCs w:val="24"/>
-        </w:rPr>
-        <w:t xml:space="preserve">
-</w:t>
-      </w:r>
-      <w:r>
-        <w:rPr>
-          <w:rFonts w:ascii="Times New Roman" w:cs="Times New Roman" w:eastAsia="Times New Roman" w:hAnsi="Times New Roman"/>
-          <w:i/>
-          <w:iCs/>
-          <w:color w:val="595959"/>
-          <w:sz w:val="22"/>
-          <w:szCs w:val="22"/>
-        </w:rPr>
-        <w:t xml:space="preserve">[Insertar aquí la captura de la ventana principal con la cola de listos, el Quantum y el proceso en ejecución]</w:t>
+        <w:drawing>
+          <wp:inline distT="0" distB="0" distL="0" distR="0">
+            <wp:extent cx="5715000" cy="3571875"/>
+            <wp:effectExtent t="0" r="0" b="0" l="0"/>
+            <wp:docPr id="2" name="main.jpg" descr="main.jpg" title="main.jpg"/>
+            <wp:cNvGraphicFramePr>
+              <a:graphicFrameLocks xmlns:a="http://schemas.openxmlformats.org/drawingml/2006/main" noChangeAspect="1"/>
+            </wp:cNvGraphicFramePr>
+            <a:graphic xmlns:a="http://schemas.openxmlformats.org/drawingml/2006/main">
+              <a:graphicData uri="http://schemas.openxmlformats.org/drawingml/2006/picture">
+                <pic:pic xmlns:pic="http://schemas.openxmlformats.org/drawingml/2006/picture">
+                  <pic:nvPicPr>
+                    <pic:cNvPr id="0" name="" descr=""/>
+                    <pic:cNvPicPr>
+                      <a:picLocks noChangeAspect="1" noChangeArrowheads="1"/>
+                    </pic:cNvPicPr>
+                  </pic:nvPicPr>
+                  <pic:blipFill>
+                    <a:blip r:embed="rId10" cstate="none"/>
+                    <a:srcRect/>
+                    <a:stretch>
+                      <a:fillRect/>
+                    </a:stretch>
+                  </pic:blipFill>
+                  <pic:spPr bwMode="auto">
+                    <a:xfrm>
+                      <a:off x="0" y="0"/>
+                      <a:ext cx="5715000" cy="3571875"/>
+                    </a:xfrm>
+                    <a:prstGeom prst="rect">
+                      <a:avLst/>
+                    </a:prstGeom>
+                  </pic:spPr>
+                </pic:pic>
+              </a:graphicData>
+            </a:graphic>
+          </wp:inline>
+        </w:drawing>
       </w:r>
     </w:p>
     <w:p>
@@ -1450,35 +1490,48 @@
     </w:p>
     <w:p>
       <w:pPr>
-        <w:pBdr>
-          <w:top w:val="single" w:color="808080" w:sz="6" w:space="8"/>
-          <w:left w:val="single" w:color="808080" w:sz="6" w:space="8"/>
-          <w:bottom w:val="single" w:color="808080" w:sz="6" w:space="8"/>
-          <w:right w:val="single" w:color="808080" w:sz="6" w:space="8"/>
-        </w:pBdr>
-        <w:shd w:fill="F2F2F2" w:val="clear"/>
-        <w:spacing w:after="80" w:before="120" w:line="240"/>
+        <w:spacing w:after="60" w:before="120"/>
         <w:jc w:val="center"/>
       </w:pPr>
       <w:r>
-        <w:rPr>
-          <w:rFonts w:ascii="Times New Roman" w:cs="Times New Roman" w:eastAsia="Times New Roman" w:hAnsi="Times New Roman"/>
-          <w:sz w:val="24"/>
-          <w:szCs w:val="24"/>
-        </w:rPr>
-        <w:t xml:space="preserve">
-</w:t>
-      </w:r>
-      <w:r>
-        <w:rPr>
-          <w:rFonts w:ascii="Times New Roman" w:cs="Times New Roman" w:eastAsia="Times New Roman" w:hAnsi="Times New Roman"/>
-          <w:i/>
-          <w:iCs/>
-          <w:color w:val="595959"/>
-          <w:sz w:val="22"/>
-          <w:szCs w:val="22"/>
-        </w:rPr>
-        <w:t xml:space="preserve">[Insertar aquí la captura de la tabla BCP mostrada con la tecla B]</w:t>
+        <w:drawing>
+          <wp:inline distT="0" distB="0" distL="0" distR="0">
+            <wp:extent cx="5143500" cy="1847850"/>
+            <wp:effectExtent t="0" r="0" b="0" l="0"/>
+            <wp:docPr id="3" name="bcp.jpg" descr="bcp.jpg" title="bcp.jpg"/>
+            <wp:cNvGraphicFramePr>
+              <a:graphicFrameLocks xmlns:a="http://schemas.openxmlformats.org/drawingml/2006/main" noChangeAspect="1"/>
+            </wp:cNvGraphicFramePr>
+            <a:graphic xmlns:a="http://schemas.openxmlformats.org/drawingml/2006/main">
+              <a:graphicData uri="http://schemas.openxmlformats.org/drawingml/2006/picture">
+                <pic:pic xmlns:pic="http://schemas.openxmlformats.org/drawingml/2006/picture">
+                  <pic:nvPicPr>
+                    <pic:cNvPr id="0" name="" descr=""/>
+                    <pic:cNvPicPr>
+                      <a:picLocks noChangeAspect="1" noChangeArrowheads="1"/>
+                    </pic:cNvPicPr>
+                  </pic:nvPicPr>
+                  <pic:blipFill>
+                    <a:blip r:embed="rId11" cstate="none"/>
+                    <a:srcRect/>
+                    <a:stretch>
+                      <a:fillRect/>
+                    </a:stretch>
+                  </pic:blipFill>
+                  <pic:spPr bwMode="auto">
+                    <a:xfrm>
+                      <a:off x="0" y="0"/>
+                      <a:ext cx="5143500" cy="1847850"/>
+                    </a:xfrm>
+                    <a:prstGeom prst="rect">
+                      <a:avLst/>
+                    </a:prstGeom>
+                  </pic:spPr>
+                </pic:pic>
+              </a:graphicData>
+            </a:graphic>
+          </wp:inline>
+        </w:drawing>
       </w:r>
     </w:p>
     <w:p>
@@ -1499,35 +1552,48 @@
     </w:p>
     <w:p>
       <w:pPr>
-        <w:pBdr>
-          <w:top w:val="single" w:color="808080" w:sz="6" w:space="8"/>
-          <w:left w:val="single" w:color="808080" w:sz="6" w:space="8"/>
-          <w:bottom w:val="single" w:color="808080" w:sz="6" w:space="8"/>
-          <w:right w:val="single" w:color="808080" w:sz="6" w:space="8"/>
-        </w:pBdr>
-        <w:shd w:fill="F2F2F2" w:val="clear"/>
-        <w:spacing w:after="80" w:before="120" w:line="240"/>
+        <w:spacing w:after="60" w:before="120"/>
         <w:jc w:val="center"/>
       </w:pPr>
       <w:r>
-        <w:rPr>
-          <w:rFonts w:ascii="Times New Roman" w:cs="Times New Roman" w:eastAsia="Times New Roman" w:hAnsi="Times New Roman"/>
-          <w:sz w:val="24"/>
-          <w:szCs w:val="24"/>
-        </w:rPr>
-        <w:t xml:space="preserve">
-</w:t>
-      </w:r>
-      <w:r>
-        <w:rPr>
-          <w:rFonts w:ascii="Times New Roman" w:cs="Times New Roman" w:eastAsia="Times New Roman" w:hAnsi="Times New Roman"/>
-          <w:i/>
-          <w:iCs/>
-          <w:color w:val="595959"/>
-          <w:sz w:val="22"/>
-          <w:szCs w:val="22"/>
-        </w:rPr>
-        <w:t xml:space="preserve">[Insertar aquí la captura de la tabla final al terminar la simulación]</w:t>
+        <w:drawing>
+          <wp:inline distT="0" distB="0" distL="0" distR="0">
+            <wp:extent cx="4953000" cy="2133600"/>
+            <wp:effectExtent t="0" r="0" b="0" l="0"/>
+            <wp:docPr id="4" name="final.jpg" descr="final.jpg" title="final.jpg"/>
+            <wp:cNvGraphicFramePr>
+              <a:graphicFrameLocks xmlns:a="http://schemas.openxmlformats.org/drawingml/2006/main" noChangeAspect="1"/>
+            </wp:cNvGraphicFramePr>
+            <a:graphic xmlns:a="http://schemas.openxmlformats.org/drawingml/2006/main">
+              <a:graphicData uri="http://schemas.openxmlformats.org/drawingml/2006/picture">
+                <pic:pic xmlns:pic="http://schemas.openxmlformats.org/drawingml/2006/picture">
+                  <pic:nvPicPr>
+                    <pic:cNvPr id="0" name="" descr=""/>
+                    <pic:cNvPicPr>
+                      <a:picLocks noChangeAspect="1" noChangeArrowheads="1"/>
+                    </pic:cNvPicPr>
+                  </pic:nvPicPr>
+                  <pic:blipFill>
+                    <a:blip r:embed="rId12" cstate="none"/>
+                    <a:srcRect/>
+                    <a:stretch>
+                      <a:fillRect/>
+                    </a:stretch>
+                  </pic:blipFill>
+                  <pic:spPr bwMode="auto">
+                    <a:xfrm>
+                      <a:off x="0" y="0"/>
+                      <a:ext cx="4953000" cy="2133600"/>
+                    </a:xfrm>
+                    <a:prstGeom prst="rect">
+                      <a:avLst/>
+                    </a:prstGeom>
+                  </pic:spPr>
+                </pic:pic>
+              </a:graphicData>
+            </a:graphic>
+          </wp:inline>
+        </w:drawing>
       </w:r>
     </w:p>
     <w:p>

</xml_diff>